<commit_message>
Correction du nombre de colonnes
</commit_message>
<xml_diff>
--- a/rapport_analyse_athletes.docx
+++ b/rapport_analyse_athletes.docx
@@ -2203,7 +2203,19 @@
         <w:rPr>
           <w:rFonts w:ascii="Times New Roman" w:hAnsi="Times New Roman" w:cs="Times New Roman"/>
         </w:rPr>
-        <w:t xml:space="preserve"> au lieu de disparaître. La table obtenue compte 456 lignes et 52 colonnes.</w:t>
+        <w:t xml:space="preserve"> au lieu de disparaître. La table obtenue compte 456 lignes et 5</w:t>
+      </w:r>
+      <w:r>
+        <w:rPr>
+          <w:rFonts w:ascii="Times New Roman" w:hAnsi="Times New Roman" w:cs="Times New Roman"/>
+        </w:rPr>
+        <w:t>8</w:t>
+      </w:r>
+      <w:r>
+        <w:rPr>
+          <w:rFonts w:ascii="Times New Roman" w:hAnsi="Times New Roman" w:cs="Times New Roman"/>
+        </w:rPr>
+        <w:t xml:space="preserve"> colonnes.</w:t>
       </w:r>
       <w:r>
         <w:rPr>
@@ -3095,24 +3107,14 @@
       <w:r>
         <w:t xml:space="preserve">Tableau </w:t>
       </w:r>
-      <w:r>
-        <w:fldChar w:fldCharType="begin"/>
-      </w:r>
-      <w:r>
-        <w:instrText xml:space="preserve"> SEQ Tableau \* ARABIC </w:instrText>
-      </w:r>
-      <w:r>
-        <w:fldChar w:fldCharType="separate"/>
-      </w:r>
-      <w:r>
-        <w:rPr>
-          <w:noProof/>
-        </w:rPr>
-        <w:t>1</w:t>
-      </w:r>
-      <w:r>
-        <w:fldChar w:fldCharType="end"/>
-      </w:r>
+      <w:fldSimple w:instr=" SEQ Tableau \* ARABIC ">
+        <w:r>
+          <w:rPr>
+            <w:noProof/>
+          </w:rPr>
+          <w:t>1</w:t>
+        </w:r>
+      </w:fldSimple>
       <w:r>
         <w:t xml:space="preserve"> Méthodes de remplacement de valeurs aberrantes</w:t>
       </w:r>
@@ -4032,24 +4034,14 @@
       <w:r>
         <w:t xml:space="preserve">Tableau </w:t>
       </w:r>
-      <w:r>
-        <w:fldChar w:fldCharType="begin"/>
-      </w:r>
-      <w:r>
-        <w:instrText xml:space="preserve"> SEQ Tableau \* ARABIC </w:instrText>
-      </w:r>
-      <w:r>
-        <w:fldChar w:fldCharType="separate"/>
-      </w:r>
-      <w:r>
-        <w:rPr>
-          <w:noProof/>
-        </w:rPr>
-        <w:t>2</w:t>
-      </w:r>
-      <w:r>
-        <w:fldChar w:fldCharType="end"/>
-      </w:r>
+      <w:fldSimple w:instr=" SEQ Tableau \* ARABIC ">
+        <w:r>
+          <w:rPr>
+            <w:noProof/>
+          </w:rPr>
+          <w:t>2</w:t>
+        </w:r>
+      </w:fldSimple>
       <w:r>
         <w:t>. Association de chaque dimension du questionnaire avec le readiness déclaré chez p01, seul participant pour lequel cette variable présente une variabilité suffisante. Corrélation de Spearman.</w:t>
       </w:r>
@@ -5255,24 +5247,14 @@
       <w:r>
         <w:t xml:space="preserve">Tableau </w:t>
       </w:r>
-      <w:r>
-        <w:fldChar w:fldCharType="begin"/>
-      </w:r>
-      <w:r>
-        <w:instrText xml:space="preserve"> SEQ Tableau \* ARABIC </w:instrText>
-      </w:r>
-      <w:r>
-        <w:fldChar w:fldCharType="separate"/>
-      </w:r>
-      <w:r>
-        <w:rPr>
-          <w:noProof/>
-        </w:rPr>
-        <w:t>3</w:t>
-      </w:r>
-      <w:r>
-        <w:fldChar w:fldCharType="end"/>
-      </w:r>
+      <w:fldSimple w:instr=" SEQ Tableau \* ARABIC ">
+        <w:r>
+          <w:rPr>
+            <w:noProof/>
+          </w:rPr>
+          <w:t>3</w:t>
+        </w:r>
+      </w:fldSimple>
       <w:r>
         <w:t xml:space="preserve">  Performances du modèle de readiness selon la configuration,</w:t>
       </w:r>
@@ -6333,24 +6315,14 @@
       <w:r>
         <w:t xml:space="preserve">Tableau </w:t>
       </w:r>
-      <w:r>
-        <w:fldChar w:fldCharType="begin"/>
-      </w:r>
-      <w:r>
-        <w:instrText xml:space="preserve"> SEQ Tableau \* ARABIC </w:instrText>
-      </w:r>
-      <w:r>
-        <w:fldChar w:fldCharType="separate"/>
-      </w:r>
-      <w:r>
-        <w:rPr>
-          <w:noProof/>
-        </w:rPr>
-        <w:t>4</w:t>
-      </w:r>
-      <w:r>
-        <w:fldChar w:fldCharType="end"/>
-      </w:r>
+      <w:fldSimple w:instr=" SEQ Tableau \* ARABIC ">
+        <w:r>
+          <w:rPr>
+            <w:noProof/>
+          </w:rPr>
+          <w:t>4</w:t>
+        </w:r>
+      </w:fldSimple>
       <w:r>
         <w:t xml:space="preserve"> Score de performance selon les 2 cibles</w:t>
       </w:r>
@@ -6765,24 +6737,14 @@
       <w:r>
         <w:t xml:space="preserve">Tableau </w:t>
       </w:r>
-      <w:r>
-        <w:fldChar w:fldCharType="begin"/>
-      </w:r>
-      <w:r>
-        <w:instrText xml:space="preserve"> SEQ Tableau \* ARABIC </w:instrText>
-      </w:r>
-      <w:r>
-        <w:fldChar w:fldCharType="separate"/>
-      </w:r>
-      <w:r>
-        <w:rPr>
-          <w:noProof/>
-        </w:rPr>
-        <w:t>5</w:t>
-      </w:r>
-      <w:r>
-        <w:fldChar w:fldCharType="end"/>
-      </w:r>
+      <w:fldSimple w:instr=" SEQ Tableau \* ARABIC ">
+        <w:r>
+          <w:rPr>
+            <w:noProof/>
+          </w:rPr>
+          <w:t>5</w:t>
+        </w:r>
+      </w:fldSimple>
       <w:r>
         <w:t xml:space="preserve"> </w:t>
       </w:r>

</xml_diff>